<commit_message>
2026-05-20 session close: Phase D documentation cleanup and procedure completion
</commit_message>
<xml_diff>
--- a/governance/OpenClaw_Phase7_Execution_Plan_v2.docx
+++ b/governance/OpenClaw_Phase7_Execution_Plan_v2.docx
@@ -11978,6 +11978,390 @@
     </w:p>
     <w:p>
       <w:pPr>
+        <w:spacing w:after="80" w:before="0"/>
+        <w:rPr>
+          <w:ins w:id="1037" w:author="Claude" w:date="2026-05-20T00:00:00Z"/>
+        </w:rPr>
+      </w:pPr>
+      <w:ins w:id="1038" w:author="Claude" w:date="2026-05-20T00:00:00Z">
+        <w:r>
+          <w:t xml:space="preserve"/>
+        </w:r>
+      </w:ins>
+    </w:p>
+    <w:p>
+      <w:pPr>
+        <w:pStyle w:val="Heading2"/>
+        <w:spacing w:after="140" w:before="280"/>
+        <w:rPr>
+          <w:ins w:id="1039" w:author="Claude" w:date="2026-05-20T00:00:00Z"/>
+        </w:rPr>
+      </w:pPr>
+      <w:ins w:id="1040" w:author="Claude" w:date="2026-05-20T00:00:00Z">
+        <w:r>
+          <w:rPr>
+            <w:rFonts w:ascii="Arial" w:cs="Arial" w:eastAsia="Arial" w:hAnsi="Arial"/>
+            <w:b/>
+            <w:bCs/>
+            <w:color w:val="2E75B6"/>
+            <w:sz w:val="26"/>
+            <w:szCs w:val="26"/>
+          </w:rPr>
+          <w:t xml:space="preserve">7.6   Browser Retrieval Phase 1 — Parallel Research Track</w:t>
+        </w:r>
+      </w:ins>
+    </w:p>
+    <w:p>
+      <w:pPr>
+        <w:spacing w:after="180" w:before="0"/>
+        <w:jc w:val="both"/>
+        <w:rPr>
+          <w:ins w:id="1041" w:author="Claude" w:date="2026-05-20T00:00:00Z"/>
+        </w:rPr>
+      </w:pPr>
+      <w:ins w:id="1042" w:author="Claude" w:date="2026-05-20T00:00:00Z">
+        <w:r>
+          <w:rPr>
+            <w:rFonts w:ascii="Arial" w:cs="Arial" w:eastAsia="Arial" w:hAnsi="Arial"/>
+            <w:b w:val="false"/>
+            <w:bCs w:val="false"/>
+            <w:color w:val="3C3C3C"/>
+            <w:sz w:val="22"/>
+            <w:szCs w:val="22"/>
+          </w:rPr>
+          <w:t xml:space="preserve">Browser Retrieval Phase 1 is a research-only parallel track, authorized 2026-05-20 (OPENCLAW-ADV-013, operator-approved). Its purpose is to determine whether Playwright-based article fetching is viable on the VPS and useful for the china_monitor_001 pilot before any live pipeline integration is considered. Phase 1 runs entirely outside the OpenClaw pipeline. Phase 2 (live integration) is not authorized under Phase D scope.</w:t>
+        </w:r>
+      </w:ins>
+    </w:p>
+    <w:p>
+      <w:pPr>
+        <w:spacing w:after="100" w:before="160"/>
+        <w:rPr>
+          <w:ins w:id="1043" w:author="Claude" w:date="2026-05-20T00:00:00Z"/>
+        </w:rPr>
+      </w:pPr>
+      <w:ins w:id="1044" w:author="Claude" w:date="2026-05-20T00:00:00Z">
+        <w:r>
+          <w:rPr>
+            <w:rFonts w:ascii="Arial" w:cs="Arial" w:eastAsia="Arial" w:hAnsi="Arial"/>
+            <w:b/>
+            <w:bCs/>
+            <w:color w:val="3C3C3C"/>
+            <w:sz w:val="22"/>
+            <w:szCs w:val="22"/>
+          </w:rPr>
+          <w:t xml:space="preserve">Architectural Position</w:t>
+        </w:r>
+      </w:ins>
+    </w:p>
+    <w:p>
+      <w:pPr>
+        <w:spacing w:after="180" w:before="0"/>
+        <w:jc w:val="both"/>
+        <w:rPr>
+          <w:ins w:id="1045" w:author="Claude" w:date="2026-05-20T00:00:00Z"/>
+        </w:rPr>
+      </w:pPr>
+      <w:ins w:id="1046" w:author="Claude" w:date="2026-05-20T00:00:00Z">
+        <w:r>
+          <w:rPr>
+            <w:rFonts w:ascii="Arial" w:cs="Arial" w:eastAsia="Arial" w:hAnsi="Arial"/>
+            <w:b w:val="false"/>
+            <w:bCs w:val="false"/>
+            <w:color w:val="3C3C3C"/>
+            <w:sz w:val="22"/>
+            <w:szCs w:val="22"/>
+          </w:rPr>
+          <w:t xml:space="preserve">Phase 1 is a standalone research script (fetch_article_text.py) running on the VPS under the openclaw_cowork user. It is not called by cron, not imported by any pipeline component, and has no write access to pipeline data directories. It reads retrieval_package.json as read-only input and writes only to /root/openclaw_phase7/article_cache/. The live pipeline (Retrieval → Orchestrator → Agent → Scrubber → Validator → Delivery) is not affected by Phase 1 in any way.</w:t>
+        </w:r>
+      </w:ins>
+    </w:p>
+    <w:p>
+      <w:pPr>
+        <w:spacing w:after="100" w:before="160"/>
+        <w:rPr>
+          <w:ins w:id="1047" w:author="Claude" w:date="2026-05-20T00:00:00Z"/>
+        </w:rPr>
+      </w:pPr>
+      <w:ins w:id="1048" w:author="Claude" w:date="2026-05-20T00:00:00Z">
+        <w:r>
+          <w:rPr>
+            <w:rFonts w:ascii="Arial" w:cs="Arial" w:eastAsia="Arial" w:hAnsi="Arial"/>
+            <w:b/>
+            <w:bCs/>
+            <w:color w:val="3C3C3C"/>
+            <w:sz w:val="22"/>
+            <w:szCs w:val="22"/>
+          </w:rPr>
+          <w:t xml:space="preserve">Phase 1 Scope</w:t>
+        </w:r>
+      </w:ins>
+    </w:p>
+    <w:p>
+      <w:pPr>
+        <w:pStyle w:val="ListParagraph"/>
+        <w:numPr>
+          <w:ilvl w:val="0"/>
+          <w:numId w:val="2"/>
+        </w:numPr>
+        <w:spacing w:after="60" w:before="0"/>
+        <w:rPr>
+          <w:ins w:id="1049" w:author="Claude" w:date="2026-05-20T00:00:00Z"/>
+        </w:rPr>
+      </w:pPr>
+      <w:ins w:id="1050" w:author="Claude" w:date="2026-05-20T00:00:00Z">
+        <w:r>
+          <w:rPr>
+            <w:rFonts w:ascii="Arial" w:cs="Arial" w:eastAsia="Arial" w:hAnsi="Arial"/>
+            <w:b w:val="false"/>
+            <w:bCs w:val="false"/>
+            <w:color w:val="3C3C3C"/>
+            <w:sz w:val="22"/>
+            <w:szCs w:val="22"/>
+          </w:rPr>
+          <w:t xml:space="preserve">Input: retrieval_package.json (read-only). Script identifies cited result_ids and attempts to fetch full article text via Playwright/Chromium.</w:t>
+        </w:r>
+      </w:ins>
+    </w:p>
+    <w:p>
+      <w:pPr>
+        <w:pStyle w:val="ListParagraph"/>
+        <w:numPr>
+          <w:ilvl w:val="0"/>
+          <w:numId w:val="2"/>
+        </w:numPr>
+        <w:spacing w:after="60" w:before="0"/>
+        <w:rPr>
+          <w:ins w:id="1051" w:author="Claude" w:date="2026-05-20T00:00:00Z"/>
+        </w:rPr>
+      </w:pPr>
+      <w:ins w:id="1052" w:author="Claude" w:date="2026-05-20T00:00:00Z">
+        <w:r>
+          <w:rPr>
+            <w:rFonts w:ascii="Arial" w:cs="Arial" w:eastAsia="Arial" w:hAnsi="Arial"/>
+            <w:b w:val="false"/>
+            <w:bCs w:val="false"/>
+            <w:color w:val="3C3C3C"/>
+            <w:sz w:val="22"/>
+            <w:szCs w:val="22"/>
+          </w:rPr>
+          <w:t xml:space="preserve">Output: one JSON file per article at /root/openclaw_phase7/article_cache/article_{result_id}.json. Schema: result_id, url, fetch_timestamp, fetch_status, article_text, word_count, notes.</w:t>
+        </w:r>
+      </w:ins>
+    </w:p>
+    <w:p>
+      <w:pPr>
+        <w:pStyle w:val="ListParagraph"/>
+        <w:numPr>
+          <w:ilvl w:val="0"/>
+          <w:numId w:val="2"/>
+        </w:numPr>
+        <w:spacing w:after="60" w:before="0"/>
+        <w:rPr>
+          <w:ins w:id="1053" w:author="Claude" w:date="2026-05-20T00:00:00Z"/>
+        </w:rPr>
+      </w:pPr>
+      <w:ins w:id="1054" w:author="Claude" w:date="2026-05-20T00:00:00Z">
+        <w:r>
+          <w:rPr>
+            <w:rFonts w:ascii="Arial" w:cs="Arial" w:eastAsia="Arial" w:hAnsi="Arial"/>
+            <w:b w:val="false"/>
+            <w:bCs w:val="false"/>
+            <w:color w:val="3C3C3C"/>
+            <w:sz w:val="22"/>
+            <w:szCs w:val="22"/>
+          </w:rPr>
+          <w:t xml:space="preserve">Scope is historical packages only during Phase 1. No live pipeline integration. Governed by 16 hard prohibitions documented in OPENCLAW-ADV-013.</w:t>
+        </w:r>
+      </w:ins>
+    </w:p>
+    <w:p>
+      <w:pPr>
+        <w:pStyle w:val="ListParagraph"/>
+        <w:numPr>
+          <w:ilvl w:val="0"/>
+          <w:numId w:val="2"/>
+        </w:numPr>
+        <w:spacing w:after="60" w:before="0"/>
+        <w:rPr>
+          <w:ins w:id="1055" w:author="Claude" w:date="2026-05-20T00:00:00Z"/>
+        </w:rPr>
+      </w:pPr>
+      <w:ins w:id="1056" w:author="Claude" w:date="2026-05-20T00:00:00Z">
+        <w:r>
+          <w:rPr>
+            <w:rFonts w:ascii="Arial" w:cs="Arial" w:eastAsia="Arial" w:hAnsi="Arial"/>
+            <w:b w:val="false"/>
+            <w:bCs w:val="false"/>
+            <w:color w:val="3C3C3C"/>
+            <w:sz w:val="22"/>
+            <w:szCs w:val="22"/>
+          </w:rPr>
+          <w:t xml:space="preserve">Implementation ownership: fetch_article_text.py and Playwright/Chromium install are Claude Code / VPS operator tasks. CoWork has no implementation role in Phase 1.</w:t>
+        </w:r>
+      </w:ins>
+    </w:p>
+    <w:p>
+      <w:pPr>
+        <w:spacing w:after="100" w:before="160"/>
+        <w:rPr>
+          <w:ins w:id="1057" w:author="Claude" w:date="2026-05-20T00:00:00Z"/>
+        </w:rPr>
+      </w:pPr>
+      <w:ins w:id="1058" w:author="Claude" w:date="2026-05-20T00:00:00Z">
+        <w:r>
+          <w:rPr>
+            <w:rFonts w:ascii="Arial" w:cs="Arial" w:eastAsia="Arial" w:hAnsi="Arial"/>
+            <w:b/>
+            <w:bCs/>
+            <w:color w:val="3C3C3C"/>
+            <w:sz w:val="22"/>
+            <w:szCs w:val="22"/>
+          </w:rPr>
+          <w:t xml:space="preserve">CoWork Role — Findings Report</w:t>
+        </w:r>
+      </w:ins>
+    </w:p>
+    <w:p>
+      <w:pPr>
+        <w:spacing w:after="180" w:before="0"/>
+        <w:jc w:val="both"/>
+        <w:rPr>
+          <w:ins w:id="1059" w:author="Claude" w:date="2026-05-20T00:00:00Z"/>
+        </w:rPr>
+      </w:pPr>
+      <w:ins w:id="1060" w:author="Claude" w:date="2026-05-20T00:00:00Z">
+        <w:r>
+          <w:rPr>
+            <w:rFonts w:ascii="Arial" w:cs="Arial" w:eastAsia="Arial" w:hAnsi="Arial"/>
+            <w:b w:val="false"/>
+            <w:bCs w:val="false"/>
+            <w:color w:val="3C3C3C"/>
+            <w:sz w:val="22"/>
+            <w:szCs w:val="22"/>
+          </w:rPr>
+          <w:t xml:space="preserve">After each Phase 1 research run, CoWork reads the article_cache/ output files and produces a structured findings report covering: fetch success rate by domain, accessibility of Chinese-source URLs from the VPS, article text quality and completeness, and any systematic failure patterns. The findings report is advisory only. No recommendation within the report authorises any pipeline change or Phase 2 work. Operator review of findings is required before any Phase 2 decision is made.</w:t>
+        </w:r>
+      </w:ins>
+    </w:p>
+    <w:p>
+      <w:pPr>
+        <w:spacing w:after="100" w:before="160"/>
+        <w:rPr>
+          <w:ins w:id="1061" w:author="Claude" w:date="2026-05-20T00:00:00Z"/>
+        </w:rPr>
+      </w:pPr>
+      <w:ins w:id="1062" w:author="Claude" w:date="2026-05-20T00:00:00Z">
+        <w:r>
+          <w:rPr>
+            <w:rFonts w:ascii="Arial" w:cs="Arial" w:eastAsia="Arial" w:hAnsi="Arial"/>
+            <w:b/>
+            <w:bCs/>
+            <w:color w:val="3C3C3C"/>
+            <w:sz w:val="22"/>
+            <w:szCs w:val="22"/>
+          </w:rPr>
+          <w:t xml:space="preserve">Two-Week Implementation Schedule</w:t>
+        </w:r>
+      </w:ins>
+    </w:p>
+    <w:p>
+      <w:pPr>
+        <w:pStyle w:val="ListParagraph"/>
+        <w:numPr>
+          <w:ilvl w:val="0"/>
+          <w:numId w:val="2"/>
+        </w:numPr>
+        <w:spacing w:after="60" w:before="0"/>
+        <w:rPr>
+          <w:ins w:id="1063" w:author="Claude" w:date="2026-05-20T00:00:00Z"/>
+        </w:rPr>
+      </w:pPr>
+      <w:ins w:id="1064" w:author="Claude" w:date="2026-05-20T00:00:00Z">
+        <w:r>
+          <w:rPr>
+            <w:rFonts w:ascii="Arial" w:cs="Arial" w:eastAsia="Arial" w:hAnsi="Arial"/>
+            <w:b w:val="false"/>
+            <w:bCs w:val="false"/>
+            <w:color w:val="3C3C3C"/>
+            <w:sz w:val="22"/>
+            <w:szCs w:val="22"/>
+          </w:rPr>
+          <w:t xml:space="preserve">Week 1 (Claude Code / VPS operator): Install Playwright and Chromium on VPS; implement fetch_article_text.py with the approved 7-field schema and all 16 prohibitions enforced; unit-test against historical retrieval_package.json files; confirm article_cache/ output structure.</w:t>
+        </w:r>
+      </w:ins>
+    </w:p>
+    <w:p>
+      <w:pPr>
+        <w:pStyle w:val="ListParagraph"/>
+        <w:numPr>
+          <w:ilvl w:val="0"/>
+          <w:numId w:val="2"/>
+        </w:numPr>
+        <w:spacing w:after="60" w:before="0"/>
+        <w:rPr>
+          <w:ins w:id="1065" w:author="Claude" w:date="2026-05-20T00:00:00Z"/>
+        </w:rPr>
+      </w:pPr>
+      <w:ins w:id="1066" w:author="Claude" w:date="2026-05-20T00:00:00Z">
+        <w:r>
+          <w:rPr>
+            <w:rFonts w:ascii="Arial" w:cs="Arial" w:eastAsia="Arial" w:hAnsi="Arial"/>
+            <w:b w:val="false"/>
+            <w:bCs w:val="false"/>
+            <w:color w:val="3C3C3C"/>
+            <w:sz w:val="22"/>
+            <w:szCs w:val="22"/>
+          </w:rPr>
+          <w:t xml:space="preserve">Week 2 (parallel with Phase D pilot runs): Run fetch_article_text.py against active retrieval_package.json outputs; sync article_cache/ to local vps_sync/ via scp; CoWork reads output and produces findings report; operator reviews fetch success rates, Chinese-source accessibility, and article quality before any Phase 2 decision.</w:t>
+        </w:r>
+      </w:ins>
+    </w:p>
+    <w:p>
+      <w:pPr>
+        <w:spacing w:after="100" w:before="160"/>
+        <w:rPr>
+          <w:ins w:id="1067" w:author="Claude" w:date="2026-05-20T00:00:00Z"/>
+        </w:rPr>
+      </w:pPr>
+      <w:ins w:id="1068" w:author="Claude" w:date="2026-05-20T00:00:00Z">
+        <w:r>
+          <w:rPr>
+            <w:rFonts w:ascii="Arial" w:cs="Arial" w:eastAsia="Arial" w:hAnsi="Arial"/>
+            <w:b/>
+            <w:bCs/>
+            <w:color w:val="3C3C3C"/>
+            <w:sz w:val="22"/>
+            <w:szCs w:val="22"/>
+          </w:rPr>
+          <w:t xml:space="preserve">Phase 2 Authorization Conditions</w:t>
+        </w:r>
+      </w:ins>
+    </w:p>
+    <w:p>
+      <w:pPr>
+        <w:spacing w:after="180" w:before="0"/>
+        <w:jc w:val="both"/>
+        <w:rPr>
+          <w:ins w:id="1069" w:author="Claude" w:date="2026-05-20T00:00:00Z"/>
+        </w:rPr>
+      </w:pPr>
+      <w:ins w:id="1070" w:author="Claude" w:date="2026-05-20T00:00:00Z">
+        <w:r>
+          <w:rPr>
+            <w:rFonts w:ascii="Arial" w:cs="Arial" w:eastAsia="Arial" w:hAnsi="Arial"/>
+            <w:b w:val="false"/>
+            <w:bCs w:val="false"/>
+            <w:color w:val="3C3C3C"/>
+            <w:sz w:val="22"/>
+            <w:szCs w:val="22"/>
+          </w:rPr>
+          <w:t xml:space="preserve">Browser Retrieval Phase 2 (live pipeline integration) is not authorized under Phase D scope and is out of scope per OPENCLAW-OPS-001 Section 2. It requires: (1) operator review of Phase 1 findings report; (2) a separate phase gate decision; and (3) a formal implementation plan covering integration point, rollback path, and validation criteria. No Phase 2 work may begin until this decision is explicitly made by the operator.</w:t>
+        </w:r>
+      </w:ins>
+    </w:p>
+    <w:p>
+      <w:pPr>
         <w:pStyle w:val="Heading2"/>
         <w:spacing w:after="140" w:before="280"/>
       </w:pPr>

</xml_diff>